<commit_message>
53800: Single approach, add data-access instructions
Removes the A/B comparison - the approach is decided: funnel from screen_view,
14 custom events. The seven excluded events from 53472 are listed with reasons
so the decision is traceable.

Adds section 7 covering how to actually see the data: DebugView setup per
platform for QA, Console reporting paths, and the BigQuery export for journey
replay. Flags that custom parameters are not reportable until registered as
custom definitions, and that registration is not backfilled - so it must happen
before release.

Co-Authored-By: Claude Opus 5 (1M context) <noreply@anthropic.com>
</commit_message>
<xml_diff>
--- a/docs/Firebase-Payment-Analytics-Spec.docx
+++ b/docs/Firebase-Payment-Analytics-Spec.docx
@@ -208,7 +208,7 @@
               <w:rPr>
                 <w:b/>
               </w:rPr>
-              <w:t xml:space="preserve">Adding these events has no impact on existing analytics. </w:t>
+              <w:t xml:space="preserve">No impact. </w:t>
             </w:r>
             <w:r>
               <w:t>The change is additive only.</w:t>
@@ -464,6 +464,38 @@
                 <w:b w:val="0"/>
                 <w:sz w:val="19"/>
               </w:rPr>
+              <w:t>User identifier</w:t>
+            </w:r>
+          </w:p>
+        </w:tc>
+        <w:tc>
+          <w:tcPr>
+            <w:tcW w:type="dxa" w:w="6192"/>
+          </w:tcPr>
+          <w:p>
+            <w:r/>
+            <w:r>
+              <w:rPr>
+                <w:b w:val="0"/>
+                <w:sz w:val="19"/>
+              </w:rPr>
+              <w:t>Retained. setUserId / Sparklight_user_id continue to carry the account number, so no report or audience loses continuity.</w:t>
+            </w:r>
+          </w:p>
+        </w:tc>
+      </w:tr>
+      <w:tr>
+        <w:tc>
+          <w:tcPr>
+            <w:tcW w:type="dxa" w:w="3312"/>
+          </w:tcPr>
+          <w:p>
+            <w:r/>
+            <w:r>
+              <w:rPr>
+                <w:b w:val="0"/>
+                <w:sz w:val="19"/>
+              </w:rPr>
               <w:t>Performance / payment processing</w:t>
             </w:r>
           </w:p>
@@ -480,6 +512,299 @@
                 <w:sz w:val="19"/>
               </w:rPr>
               <w:t>No impact — calls are fire-and-forget and wrapped in try/catch.</w:t>
+            </w:r>
+          </w:p>
+        </w:tc>
+      </w:tr>
+    </w:tbl>
+    <w:p/>
+    <w:p>
+      <w:r>
+        <w:rPr>
+          <w:b/>
+          <w:color w:val="632965"/>
+          <w:sz w:val="27"/>
+        </w:rPr>
+        <w:t>3. Approach</w:t>
+      </w:r>
+    </w:p>
+    <w:p>
+      <w:r>
+        <w:t>Funnel steps come from the existing screen_view. Custom events are added only where they carry information a screen cannot.</w:t>
+      </w:r>
+    </w:p>
+    <w:p>
+      <w:r>
+        <w:t>A screen tells you where a customer was. It cannot tell you what they chose or what happened — success and failure both land on PaymentConfirmation, so screen_view records them identically. Custom events fill exactly that gap.</w:t>
+      </w:r>
+    </w:p>
+    <w:p>
+      <w:r>
+        <w:t>Applying that rule, seven events from 53472 are not implemented because screen_view already records the same fact:</w:t>
+      </w:r>
+    </w:p>
+    <w:tbl>
+      <w:tblPr>
+        <w:tblStyle w:val="TableGrid"/>
+        <w:tblW w:type="auto" w:w="0"/>
+        <w:tblLook w:firstColumn="1" w:firstRow="1" w:lastColumn="0" w:lastRow="0" w:noHBand="0" w:noVBand="1" w:val="04A0"/>
+      </w:tblPr>
+      <w:tblGrid>
+        <w:gridCol w:w="4824"/>
+        <w:gridCol w:w="4824"/>
+      </w:tblGrid>
+      <w:tr>
+        <w:tc>
+          <w:tcPr>
+            <w:tcW w:type="dxa" w:w="3744"/>
+            <w:shd w:val="clear" w:fill="F2F2F5"/>
+          </w:tcPr>
+          <w:p>
+            <w:r>
+              <w:rPr>
+                <w:b/>
+                <w:sz w:val="19"/>
+              </w:rPr>
+              <w:t>Excluded event</w:t>
+            </w:r>
+          </w:p>
+        </w:tc>
+        <w:tc>
+          <w:tcPr>
+            <w:tcW w:type="dxa" w:w="5760"/>
+            <w:shd w:val="clear" w:fill="F2F2F5"/>
+          </w:tcPr>
+          <w:p>
+            <w:r>
+              <w:rPr>
+                <w:b/>
+                <w:sz w:val="19"/>
+              </w:rPr>
+              <w:t>Reason</w:t>
+            </w:r>
+          </w:p>
+        </w:tc>
+      </w:tr>
+      <w:tr>
+        <w:tc>
+          <w:tcPr>
+            <w:tcW w:type="dxa" w:w="3744"/>
+          </w:tcPr>
+          <w:p>
+            <w:r/>
+            <w:r>
+              <w:rPr>
+                <w:b w:val="0"/>
+                <w:sz w:val="19"/>
+              </w:rPr>
+              <w:t>payment_flow_started</w:t>
+            </w:r>
+          </w:p>
+        </w:tc>
+        <w:tc>
+          <w:tcPr>
+            <w:tcW w:type="dxa" w:w="5760"/>
+          </w:tcPr>
+          <w:p>
+            <w:r/>
+            <w:r>
+              <w:rPr>
+                <w:b w:val="0"/>
+                <w:sz w:val="19"/>
+              </w:rPr>
+              <w:t>Duplicate of screen_view: MakePayment</w:t>
+            </w:r>
+          </w:p>
+        </w:tc>
+      </w:tr>
+      <w:tr>
+        <w:tc>
+          <w:tcPr>
+            <w:tcW w:type="dxa" w:w="3744"/>
+          </w:tcPr>
+          <w:p>
+            <w:r/>
+            <w:r>
+              <w:rPr>
+                <w:b w:val="0"/>
+                <w:sz w:val="19"/>
+              </w:rPr>
+              <w:t>payment_reviewed</w:t>
+            </w:r>
+          </w:p>
+        </w:tc>
+        <w:tc>
+          <w:tcPr>
+            <w:tcW w:type="dxa" w:w="5760"/>
+          </w:tcPr>
+          <w:p>
+            <w:r/>
+            <w:r>
+              <w:rPr>
+                <w:b w:val="0"/>
+                <w:sz w:val="19"/>
+              </w:rPr>
+              <w:t>Duplicate of screen_view: MakePaymentReview</w:t>
+            </w:r>
+          </w:p>
+        </w:tc>
+      </w:tr>
+      <w:tr>
+        <w:tc>
+          <w:tcPr>
+            <w:tcW w:type="dxa" w:w="3744"/>
+          </w:tcPr>
+          <w:p>
+            <w:r/>
+            <w:r>
+              <w:rPr>
+                <w:b w:val="0"/>
+                <w:sz w:val="19"/>
+              </w:rPr>
+              <w:t>payment_method_viewed</w:t>
+            </w:r>
+          </w:p>
+        </w:tc>
+        <w:tc>
+          <w:tcPr>
+            <w:tcW w:type="dxa" w:w="5760"/>
+          </w:tcPr>
+          <w:p>
+            <w:r/>
+            <w:r>
+              <w:rPr>
+                <w:b w:val="0"/>
+                <w:sz w:val="19"/>
+              </w:rPr>
+              <w:t>Duplicate of screen_view: PaymentMethods</w:t>
+            </w:r>
+          </w:p>
+        </w:tc>
+      </w:tr>
+      <w:tr>
+        <w:tc>
+          <w:tcPr>
+            <w:tcW w:type="dxa" w:w="3744"/>
+          </w:tcPr>
+          <w:p>
+            <w:r/>
+            <w:r>
+              <w:rPr>
+                <w:b w:val="0"/>
+                <w:sz w:val="19"/>
+              </w:rPr>
+              <w:t>autopay_viewed</w:t>
+            </w:r>
+          </w:p>
+        </w:tc>
+        <w:tc>
+          <w:tcPr>
+            <w:tcW w:type="dxa" w:w="5760"/>
+          </w:tcPr>
+          <w:p>
+            <w:r/>
+            <w:r>
+              <w:rPr>
+                <w:b w:val="0"/>
+                <w:sz w:val="19"/>
+              </w:rPr>
+              <w:t>Duplicate of screen_view: AutoPay</w:t>
+            </w:r>
+          </w:p>
+        </w:tc>
+      </w:tr>
+      <w:tr>
+        <w:tc>
+          <w:tcPr>
+            <w:tcW w:type="dxa" w:w="3744"/>
+          </w:tcPr>
+          <w:p>
+            <w:r/>
+            <w:r>
+              <w:rPr>
+                <w:b w:val="0"/>
+                <w:sz w:val="19"/>
+              </w:rPr>
+              <w:t>payment_amount_selected</w:t>
+            </w:r>
+          </w:p>
+        </w:tc>
+        <w:tc>
+          <w:tcPr>
+            <w:tcW w:type="dxa" w:w="5760"/>
+          </w:tcPr>
+          <w:p>
+            <w:r/>
+            <w:r>
+              <w:rPr>
+                <w:b w:val="0"/>
+                <w:sz w:val="19"/>
+              </w:rPr>
+              <w:t>Renamed to payment_type_selected for consistency</w:t>
+            </w:r>
+          </w:p>
+        </w:tc>
+      </w:tr>
+      <w:tr>
+        <w:tc>
+          <w:tcPr>
+            <w:tcW w:type="dxa" w:w="3744"/>
+          </w:tcPr>
+          <w:p>
+            <w:r/>
+            <w:r>
+              <w:rPr>
+                <w:b w:val="0"/>
+                <w:sz w:val="19"/>
+              </w:rPr>
+              <w:t>payment_method_updated, payment_method_default_changed</w:t>
+            </w:r>
+          </w:p>
+        </w:tc>
+        <w:tc>
+          <w:tcPr>
+            <w:tcW w:type="dxa" w:w="5760"/>
+          </w:tcPr>
+          <w:p>
+            <w:r/>
+            <w:r>
+              <w:rPr>
+                <w:b w:val="0"/>
+                <w:sz w:val="19"/>
+              </w:rPr>
+              <w:t>Not supported by the current app — no update or default-selection flow exists</w:t>
+            </w:r>
+          </w:p>
+        </w:tc>
+      </w:tr>
+      <w:tr>
+        <w:tc>
+          <w:tcPr>
+            <w:tcW w:type="dxa" w:w="3744"/>
+          </w:tcPr>
+          <w:p>
+            <w:r/>
+            <w:r>
+              <w:rPr>
+                <w:b w:val="0"/>
+                <w:sz w:val="19"/>
+              </w:rPr>
+              <w:t>payment_flow_abandoned</w:t>
+            </w:r>
+          </w:p>
+        </w:tc>
+        <w:tc>
+          <w:tcPr>
+            <w:tcW w:type="dxa" w:w="5760"/>
+          </w:tcPr>
+          <w:p>
+            <w:r/>
+            <w:r>
+              <w:rPr>
+                <w:b w:val="0"/>
+                <w:sz w:val="19"/>
+              </w:rPr>
+              <w:t>Cannot be fired reliably — app kill, backgrounding and navigation-away are indistinguishable. Derived instead (see §8).</w:t>
             </w:r>
           </w:p>
         </w:tc>
@@ -506,250 +831,10 @@
               <w:rPr>
                 <w:b/>
               </w:rPr>
-              <w:t xml:space="preserve">Decision taken: the existing user identifier is retained. </w:t>
+              <w:t xml:space="preserve">Why: </w:t>
             </w:r>
             <w:r>
-              <w:t>setUserId and Sparklight_user_id continue to carry the account number, so no user-scoped report or audience loses continuity. With that decided, this work has no impact on existing analytics at all — there is no exception. The one related change is closing the identifier reset gaps in §6, which only makes existing behaviour match its intent and affects no historical data.</w:t>
-            </w:r>
-          </w:p>
-        </w:tc>
-      </w:tr>
-    </w:tbl>
-    <w:p/>
-    <w:p>
-      <w:r>
-        <w:rPr>
-          <w:b/>
-          <w:color w:val="632965"/>
-          <w:sz w:val="27"/>
-        </w:rPr>
-        <w:t>3. Two approaches</w:t>
-      </w:r>
-    </w:p>
-    <w:tbl>
-      <w:tblPr>
-        <w:tblStyle w:val="TableGrid"/>
-        <w:tblW w:type="auto" w:w="0"/>
-        <w:tblLook w:firstColumn="1" w:firstRow="1" w:lastColumn="0" w:lastRow="0" w:noHBand="0" w:noVBand="1" w:val="04A0"/>
-      </w:tblPr>
-      <w:tblGrid>
-        <w:gridCol w:w="3216"/>
-        <w:gridCol w:w="3216"/>
-        <w:gridCol w:w="3216"/>
-      </w:tblGrid>
-      <w:tr>
-        <w:tc>
-          <w:tcPr>
-            <w:tcW w:type="dxa" w:w="1152"/>
-            <w:shd w:val="clear" w:fill="F2F2F5"/>
-          </w:tcPr>
-          <w:p>
-            <w:r>
-              <w:rPr>
-                <w:b/>
-                <w:sz w:val="19"/>
-              </w:rPr>
-            </w:r>
-          </w:p>
-        </w:tc>
-        <w:tc>
-          <w:tcPr>
-            <w:tcW w:type="dxa" w:w="3888"/>
-            <w:shd w:val="clear" w:fill="F2F2F5"/>
-          </w:tcPr>
-          <w:p>
-            <w:r>
-              <w:rPr>
-                <w:b/>
-                <w:sz w:val="19"/>
-              </w:rPr>
-              <w:t>A — all 21 events as ticketed</w:t>
-            </w:r>
-          </w:p>
-        </w:tc>
-        <w:tc>
-          <w:tcPr>
-            <w:tcW w:type="dxa" w:w="4464"/>
-            <w:shd w:val="clear" w:fill="F2F2F5"/>
-          </w:tcPr>
-          <w:p>
-            <w:r>
-              <w:rPr>
-                <w:b/>
-                <w:sz w:val="19"/>
-              </w:rPr>
-              <w:t>B — screen_view for funnel + custom events (RECOMMENDED)</w:t>
-            </w:r>
-          </w:p>
-        </w:tc>
-      </w:tr>
-      <w:tr>
-        <w:tc>
-          <w:tcPr>
-            <w:tcW w:type="dxa" w:w="1152"/>
-          </w:tcPr>
-          <w:p>
-            <w:r/>
-            <w:r>
-              <w:rPr>
-                <w:b w:val="0"/>
-                <w:sz w:val="19"/>
-              </w:rPr>
-              <w:t>Events</w:t>
-            </w:r>
-          </w:p>
-        </w:tc>
-        <w:tc>
-          <w:tcPr>
-            <w:tcW w:type="dxa" w:w="3888"/>
-          </w:tcPr>
-          <w:p>
-            <w:r/>
-            <w:r>
-              <w:rPr>
-                <w:b w:val="0"/>
-                <w:sz w:val="19"/>
-              </w:rPr>
-              <w:t>21</w:t>
-            </w:r>
-          </w:p>
-        </w:tc>
-        <w:tc>
-          <w:tcPr>
-            <w:tcW w:type="dxa" w:w="4464"/>
-          </w:tcPr>
-          <w:p>
-            <w:r/>
-            <w:r>
-              <w:rPr>
-                <w:b w:val="0"/>
-                <w:sz w:val="19"/>
-              </w:rPr>
-              <w:t>14</w:t>
-            </w:r>
-          </w:p>
-        </w:tc>
-      </w:tr>
-      <w:tr>
-        <w:tc>
-          <w:tcPr>
-            <w:tcW w:type="dxa" w:w="1152"/>
-          </w:tcPr>
-          <w:p>
-            <w:r/>
-            <w:r>
-              <w:rPr>
-                <w:b w:val="0"/>
-                <w:sz w:val="19"/>
-              </w:rPr>
-              <w:t>Pros</w:t>
-            </w:r>
-          </w:p>
-        </w:tc>
-        <w:tc>
-          <w:tcPr>
-            <w:tcW w:type="dxa" w:w="3888"/>
-          </w:tcPr>
-          <w:p>
-            <w:r/>
-            <w:r>
-              <w:rPr>
-                <w:b w:val="0"/>
-                <w:sz w:val="19"/>
-              </w:rPr>
-              <w:t>Matches 53472 exactly. No negotiation with Analytics.</w:t>
-            </w:r>
-          </w:p>
-        </w:tc>
-        <w:tc>
-          <w:tcPr>
-            <w:tcW w:type="dxa" w:w="4464"/>
-          </w:tcPr>
-          <w:p>
-            <w:r/>
-            <w:r>
-              <w:rPr>
-                <w:b w:val="0"/>
-                <w:sz w:val="19"/>
-              </w:rPr>
-              <w:t>Every event carries information not otherwise obtainable. Half the call sites to keep in sync across two apps. Abandonment computed correctly instead of guessed.</w:t>
-            </w:r>
-          </w:p>
-        </w:tc>
-      </w:tr>
-      <w:tr>
-        <w:tc>
-          <w:tcPr>
-            <w:tcW w:type="dxa" w:w="1152"/>
-          </w:tcPr>
-          <w:p>
-            <w:r/>
-            <w:r>
-              <w:rPr>
-                <w:b w:val="0"/>
-                <w:sz w:val="19"/>
-              </w:rPr>
-              <w:t>Cons</w:t>
-            </w:r>
-          </w:p>
-        </w:tc>
-        <w:tc>
-          <w:tcPr>
-            <w:tcW w:type="dxa" w:w="3888"/>
-          </w:tcPr>
-          <w:p>
-            <w:r/>
-            <w:r>
-              <w:rPr>
-                <w:b w:val="0"/>
-                <w:sz w:val="19"/>
-              </w:rPr>
-              <w:t>Four events duplicate screen_view (payment_flow_started, payment_reviewed, payment_method_viewed, autopay_viewed). 42 call sites across both apps. payment_flow_abandoned cannot be fired reliably — app kill, backgrounding and navigation-away are indistinguishable.</w:t>
-            </w:r>
-          </w:p>
-        </w:tc>
-        <w:tc>
-          <w:tcPr>
-            <w:tcW w:type="dxa" w:w="4464"/>
-          </w:tcPr>
-          <w:p>
-            <w:r/>
-            <w:r>
-              <w:rPr>
-                <w:b w:val="0"/>
-                <w:sz w:val="19"/>
-              </w:rPr>
-              <w:t>Funnel steps come from screen_view, so dashboards must be pointed there. No dashboards exist yet, so the cost is zero today.</w:t>
-            </w:r>
-          </w:p>
-        </w:tc>
-      </w:tr>
-    </w:tbl>
-    <w:p/>
-    <w:tbl>
-      <w:tblPr>
-        <w:tblStyle w:val="TableGrid"/>
-        <w:tblW w:type="auto" w:w="0"/>
-        <w:tblLook w:firstColumn="1" w:firstRow="1" w:lastColumn="0" w:lastRow="0" w:noHBand="0" w:noVBand="1" w:val="04A0"/>
-      </w:tblPr>
-      <w:tblGrid>
-        <w:gridCol w:w="9648"/>
-      </w:tblGrid>
-      <w:tr>
-        <w:tc>
-          <w:tcPr>
-            <w:tcW w:type="dxa" w:w="9648"/>
-            <w:shd w:val="clear" w:fill="E8F6EA"/>
-          </w:tcPr>
-          <w:p>
-            <w:r>
-              <w:rPr>
-                <w:b/>
-              </w:rPr>
-              <w:t xml:space="preserve">Recommendation: Approach B. </w:t>
-            </w:r>
-            <w:r>
-              <w:t>Screens answer where customers drop. Events should answer what they chose, what happened, and what broke. An event that restates a screen adds volume and drift risk without answering a new question.</w:t>
+              <w:t>emitting an event that restates a screen means two systems reporting the same fact, kept in sync across two apps forever. They drift the first time someone adds a screen and updates only one.</w:t>
             </w:r>
           </w:p>
         </w:tc>
@@ -922,7 +1007,7 @@
     <w:p/>
     <w:p>
       <w:r>
-        <w:t>Attach payment_attempt_id to every payment event; ordering by timestamp within it reconstructs the journey. Satisfies AC4, AC5 and AC6 of 53800 with one parameter and no personal data.</w:t>
+        <w:t>Attach payment_attempt_id to every payment event; ordering by timestamp within it reconstructs the journey. It identifies an attempt, not a person — no personal data is involved. Satisfies AC4, AC5 and AC6 of 53800.</w:t>
       </w:r>
     </w:p>
     <w:p>
@@ -1885,7 +1970,7 @@
           <w:color w:val="632965"/>
           <w:sz w:val="27"/>
         </w:rPr>
-        <w:t>6. Privacy</w:t>
+        <w:t>6. Privacy &amp; customer identifier</w:t>
       </w:r>
     </w:p>
     <w:p>
@@ -1923,7 +2008,7 @@
           <w:color w:val="5C5C66"/>
           <w:sz w:val="18"/>
         </w:rPr>
-        <w:t>CUSTOMER IDENTIFIER — RETAINED, WITH RESET GAPS TO CLOSE</w:t>
+        <w:t>IDENTIFIER — RETAINED, WITH RESET GAPS TO CLOSE</w:t>
       </w:r>
     </w:p>
     <w:p>
@@ -1933,7 +2018,7 @@
     </w:p>
     <w:p>
       <w:r>
-        <w:t>Adding payment events does change what that identifier is joinable to: previously logins and screen views, now also payment behaviour, method type and amount band. Two controls keep that acceptable, and both are already in this spec — amounts are bucketed rather than exact, and no new identifier is added to any payment event.</w:t>
+        <w:t>Two controls keep that acceptable, and both are already in this spec: amounts are bucketed rather than exact, and no new identifier is added to any payment event.</w:t>
       </w:r>
     </w:p>
     <w:p>
@@ -2165,7 +2250,7 @@
               <w:rPr>
                 <w:b/>
               </w:rPr>
-              <w:t xml:space="preserve">Why this matters more once payment events exist. </w:t>
+              <w:t xml:space="preserve">Why this matters once payment events exist. </w:t>
             </w:r>
             <w:r>
               <w:t>The two paths that do not clear leave the identifier pointing at the previous account. Any event fired before the next login is attributed to the wrong customer — with payment events, that means a payment journey recorded against someone who did not make it. The token-expiry failures that trigger redirectToLogin() are known to occur in production.</w:t>
@@ -2186,7 +2271,7 @@
         <w:t xml:space="preserve"> </w:t>
       </w:r>
       <w:r>
-        <w:t>add the reset to redirectToLogin() and MaintenanceContext.performLogout() in both apps, and add the missing GlobalErrorModal reset in Residential. Roughly ten lines per app. This is a defect in existing behaviour rather than new scope — the intent to clear on logout is already there, it simply misses two exits.</w:t>
+        <w:t>add the reset to redirectToLogin() and MaintenanceContext.performLogout() in both apps, and add the missing GlobalErrorModal reset in Residential. Roughly ten lines per app. This is a defect in existing behaviour rather than new scope.</w:t>
       </w:r>
     </w:p>
     <w:p>
@@ -2196,7 +2281,464 @@
           <w:color w:val="632965"/>
           <w:sz w:val="27"/>
         </w:rPr>
-        <w:t>7. Dashboard views enabled</w:t>
+        <w:t>7. How to view the data</w:t>
+      </w:r>
+    </w:p>
+    <w:p>
+      <w:r>
+        <w:rPr>
+          <w:b/>
+          <w:color w:val="5C5C66"/>
+          <w:sz w:val="18"/>
+        </w:rPr>
+        <w:t>A. DURING DEVELOPMENT AND QA — DEBUGVIEW (REAL TIME)</w:t>
+      </w:r>
+    </w:p>
+    <w:p>
+      <w:r>
+        <w:t>DebugView shows events from a single device within seconds. This is how QA validates the implementation.</w:t>
+      </w:r>
+    </w:p>
+    <w:p>
+      <w:pPr>
+        <w:pStyle w:val="ListBullet"/>
+      </w:pPr>
+      <w:r>
+        <w:t>Enable debug mode: Android — adb shell setprop debug.firebase.analytics.app com.sparklight (Residential) or com.sparklight.customer.business.app (Business). iOS — add launch argument -FIRDebugEnabled in the Xcode scheme.</w:t>
+      </w:r>
+    </w:p>
+    <w:p>
+      <w:pPr>
+        <w:pStyle w:val="ListBullet"/>
+      </w:pPr>
+      <w:r>
+        <w:t>Firebase Console → Analytics → DebugView.</w:t>
+      </w:r>
+    </w:p>
+    <w:p>
+      <w:pPr>
+        <w:pStyle w:val="ListBullet"/>
+      </w:pPr>
+      <w:r>
+        <w:t>Select the device in the top-left dropdown.</w:t>
+      </w:r>
+    </w:p>
+    <w:p>
+      <w:pPr>
+        <w:pStyle w:val="ListBullet"/>
+      </w:pPr>
+      <w:r>
+        <w:t>Walk the payment flow — events appear in a live timeline; click one to see its parameters.</w:t>
+      </w:r>
+    </w:p>
+    <w:p>
+      <w:r>
+        <w:t>Turn debug mode off afterwards (adb shell setprop debug.firebase.analytics.app .none.), or that device stays excluded from normal reporting.</w:t>
+      </w:r>
+    </w:p>
+    <w:p>
+      <w:r>
+        <w:rPr>
+          <w:b/>
+          <w:color w:val="5C5C66"/>
+          <w:sz w:val="18"/>
+        </w:rPr>
+        <w:t>B. IN REPORTING — FIREBASE CONSOLE (24-HOUR DELAY)</w:t>
+      </w:r>
+    </w:p>
+    <w:p>
+      <w:pPr>
+        <w:pStyle w:val="ListBullet"/>
+      </w:pPr>
+      <w:r>
+        <w:rPr>
+          <w:b/>
+        </w:rPr>
+        <w:t>Analytics → Events</w:t>
+      </w:r>
+      <w:r>
+        <w:t xml:space="preserve"> — count per event name, per day. Confirms events are arriving in volume.</w:t>
+      </w:r>
+    </w:p>
+    <w:p>
+      <w:pPr>
+        <w:pStyle w:val="ListBullet"/>
+      </w:pPr>
+      <w:r>
+        <w:rPr>
+          <w:b/>
+        </w:rPr>
+        <w:t>Analytics → Explore → Funnel exploration</w:t>
+      </w:r>
+      <w:r>
+        <w:t xml:space="preserve"> — build the drop-off funnel using screen_view with screen_name as each step: MakePayment → MakePaymentMethod → MakePaymentReview → PaymentConfirmation.</w:t>
+      </w:r>
+    </w:p>
+    <w:p>
+      <w:pPr>
+        <w:pStyle w:val="ListBullet"/>
+      </w:pPr>
+      <w:r>
+        <w:rPr>
+          <w:b/>
+        </w:rPr>
+        <w:t>Analytics → Explore → Free form</w:t>
+      </w:r>
+      <w:r>
+        <w:t xml:space="preserve"> — cross-tabulate, e.g. payment_failed broken down by failure_reason.</w:t>
+      </w:r>
+    </w:p>
+    <w:tbl>
+      <w:tblPr>
+        <w:tblStyle w:val="TableGrid"/>
+        <w:tblW w:type="auto" w:w="0"/>
+        <w:tblLook w:firstColumn="1" w:firstRow="1" w:lastColumn="0" w:lastRow="0" w:noHBand="0" w:noVBand="1" w:val="04A0"/>
+      </w:tblPr>
+      <w:tblGrid>
+        <w:gridCol w:w="9648"/>
+      </w:tblGrid>
+      <w:tr>
+        <w:tc>
+          <w:tcPr>
+            <w:tcW w:type="dxa" w:w="9648"/>
+            <w:shd w:val="clear" w:fill="FFF4E0"/>
+          </w:tcPr>
+          <w:p>
+            <w:r>
+              <w:rPr>
+                <w:b/>
+              </w:rPr>
+              <w:t xml:space="preserve">Required setup — parameters are not reportable until registered. </w:t>
+            </w:r>
+            <w:r>
+              <w:t>Firebase collects custom parameters immediately, but they will NOT appear in Console reports until each is registered as a custom definition. Without this step the events show up with no usable breakdowns, which reads like a broken implementation. Go to Analytics → Custom definitions → Create custom dimension and register each parameter, event-scoped: payment_type, payment_method_type, card_type, amount_bucket, failure_reason, entry_point, payment_attempt_id, endpoint, status, step, field, reason, seconds. That is 13 dimensions against a limit of 50. Data is only available from the moment of registration — it is not backfilled, so register these BEFORE release.</w:t>
+            </w:r>
+          </w:p>
+        </w:tc>
+      </w:tr>
+    </w:tbl>
+    <w:p/>
+    <w:p>
+      <w:r>
+        <w:rPr>
+          <w:b/>
+          <w:color w:val="5C5C66"/>
+          <w:sz w:val="18"/>
+        </w:rPr>
+        <w:t>C. JOURNEY REPLAY — BIGQUERY</w:t>
+      </w:r>
+    </w:p>
+    <w:p>
+      <w:r>
+        <w:t>Console reports are aggregated. To see one customer's exact sequence — the AC5 requirement — you need event-level rows, which means the BigQuery export.</w:t>
+      </w:r>
+    </w:p>
+    <w:p>
+      <w:pPr>
+        <w:pStyle w:val="ListBullet"/>
+      </w:pPr>
+      <w:r>
+        <w:t>Firebase Console → Project settings → Integrations → BigQuery → link, and enable the daily export for both apps.</w:t>
+      </w:r>
+    </w:p>
+    <w:p>
+      <w:pPr>
+        <w:pStyle w:val="ListBullet"/>
+      </w:pPr>
+      <w:r>
+        <w:t>Query a single attempt (example below).</w:t>
+      </w:r>
+    </w:p>
+    <w:p>
+      <w:r>
+        <w:rPr>
+          <w:rFonts w:ascii="Consolas" w:hAnsi="Consolas"/>
+          <w:sz w:val="18"/>
+        </w:rPr>
+        <w:t>SELECT event_timestamp, event_name,</w:t>
+        <w:br/>
+        <w:t xml:space="preserve">       (SELECT value.string_value FROM UNNEST(event_params)</w:t>
+        <w:br/>
+        <w:t xml:space="preserve">        WHERE key = 'payment_attempt_id') AS attempt_id</w:t>
+        <w:br/>
+        <w:t>FROM `&lt;project&gt;.analytics_&lt;id&gt;.events_*`</w:t>
+        <w:br/>
+        <w:t>WHERE event_name LIKE 'payment%'</w:t>
+        <w:br/>
+        <w:t>ORDER BY event_timestamp</w:t>
+      </w:r>
+    </w:p>
+    <w:p>
+      <w:r>
+        <w:t>Export begins from the day it is linked; there is no historical backfill.</w:t>
+      </w:r>
+    </w:p>
+    <w:p>
+      <w:r>
+        <w:rPr>
+          <w:b/>
+          <w:color w:val="5C5C66"/>
+          <w:sz w:val="18"/>
+        </w:rPr>
+        <w:t>D. WHO DOES WHAT</w:t>
+      </w:r>
+    </w:p>
+    <w:tbl>
+      <w:tblPr>
+        <w:tblStyle w:val="TableGrid"/>
+        <w:tblW w:type="auto" w:w="0"/>
+        <w:tblLook w:firstColumn="1" w:firstRow="1" w:lastColumn="0" w:lastRow="0" w:noHBand="0" w:noVBand="1" w:val="04A0"/>
+      </w:tblPr>
+      <w:tblGrid>
+        <w:gridCol w:w="3216"/>
+        <w:gridCol w:w="3216"/>
+        <w:gridCol w:w="3216"/>
+      </w:tblGrid>
+      <w:tr>
+        <w:tc>
+          <w:tcPr>
+            <w:tcW w:type="dxa" w:w="3456"/>
+            <w:shd w:val="clear" w:fill="F2F2F5"/>
+          </w:tcPr>
+          <w:p>
+            <w:r>
+              <w:rPr>
+                <w:b/>
+                <w:sz w:val="19"/>
+              </w:rPr>
+              <w:t>Task</w:t>
+            </w:r>
+          </w:p>
+        </w:tc>
+        <w:tc>
+          <w:tcPr>
+            <w:tcW w:type="dxa" w:w="2016"/>
+            <w:shd w:val="clear" w:fill="F2F2F5"/>
+          </w:tcPr>
+          <w:p>
+            <w:r>
+              <w:rPr>
+                <w:b/>
+                <w:sz w:val="19"/>
+              </w:rPr>
+              <w:t>Owner</w:t>
+            </w:r>
+          </w:p>
+        </w:tc>
+        <w:tc>
+          <w:tcPr>
+            <w:tcW w:type="dxa" w:w="4032"/>
+            <w:shd w:val="clear" w:fill="F2F2F5"/>
+          </w:tcPr>
+          <w:p>
+            <w:r>
+              <w:rPr>
+                <w:b/>
+                <w:sz w:val="19"/>
+              </w:rPr>
+              <w:t>When</w:t>
+            </w:r>
+          </w:p>
+        </w:tc>
+      </w:tr>
+      <w:tr>
+        <w:tc>
+          <w:tcPr>
+            <w:tcW w:type="dxa" w:w="3456"/>
+          </w:tcPr>
+          <w:p>
+            <w:r/>
+            <w:r>
+              <w:rPr>
+                <w:b w:val="0"/>
+                <w:sz w:val="19"/>
+              </w:rPr>
+              <w:t>Register the 13 custom dimensions</w:t>
+            </w:r>
+          </w:p>
+        </w:tc>
+        <w:tc>
+          <w:tcPr>
+            <w:tcW w:type="dxa" w:w="2016"/>
+          </w:tcPr>
+          <w:p>
+            <w:r/>
+            <w:r>
+              <w:rPr>
+                <w:b w:val="0"/>
+                <w:sz w:val="19"/>
+              </w:rPr>
+              <w:t>Analytics</w:t>
+            </w:r>
+          </w:p>
+        </w:tc>
+        <w:tc>
+          <w:tcPr>
+            <w:tcW w:type="dxa" w:w="4032"/>
+          </w:tcPr>
+          <w:p>
+            <w:r/>
+            <w:r>
+              <w:rPr>
+                <w:b w:val="0"/>
+                <w:sz w:val="19"/>
+              </w:rPr>
+              <w:t>Before release — not backfilled</w:t>
+            </w:r>
+          </w:p>
+        </w:tc>
+      </w:tr>
+      <w:tr>
+        <w:tc>
+          <w:tcPr>
+            <w:tcW w:type="dxa" w:w="3456"/>
+          </w:tcPr>
+          <w:p>
+            <w:r/>
+            <w:r>
+              <w:rPr>
+                <w:b w:val="0"/>
+                <w:sz w:val="19"/>
+              </w:rPr>
+              <w:t>Link BigQuery export</w:t>
+            </w:r>
+          </w:p>
+        </w:tc>
+        <w:tc>
+          <w:tcPr>
+            <w:tcW w:type="dxa" w:w="2016"/>
+          </w:tcPr>
+          <w:p>
+            <w:r/>
+            <w:r>
+              <w:rPr>
+                <w:b w:val="0"/>
+                <w:sz w:val="19"/>
+              </w:rPr>
+              <w:t>Analytics</w:t>
+            </w:r>
+          </w:p>
+        </w:tc>
+        <w:tc>
+          <w:tcPr>
+            <w:tcW w:type="dxa" w:w="4032"/>
+          </w:tcPr>
+          <w:p>
+            <w:r/>
+            <w:r>
+              <w:rPr>
+                <w:b w:val="0"/>
+                <w:sz w:val="19"/>
+              </w:rPr>
+              <w:t>Before release, if journey replay is required</w:t>
+            </w:r>
+          </w:p>
+        </w:tc>
+      </w:tr>
+      <w:tr>
+        <w:tc>
+          <w:tcPr>
+            <w:tcW w:type="dxa" w:w="3456"/>
+          </w:tcPr>
+          <w:p>
+            <w:r/>
+            <w:r>
+              <w:rPr>
+                <w:b w:val="0"/>
+                <w:sz w:val="19"/>
+              </w:rPr>
+              <w:t>Validate events in DebugView</w:t>
+            </w:r>
+          </w:p>
+        </w:tc>
+        <w:tc>
+          <w:tcPr>
+            <w:tcW w:type="dxa" w:w="2016"/>
+          </w:tcPr>
+          <w:p>
+            <w:r/>
+            <w:r>
+              <w:rPr>
+                <w:b w:val="0"/>
+                <w:sz w:val="19"/>
+              </w:rPr>
+              <w:t>QA</w:t>
+            </w:r>
+          </w:p>
+        </w:tc>
+        <w:tc>
+          <w:tcPr>
+            <w:tcW w:type="dxa" w:w="4032"/>
+          </w:tcPr>
+          <w:p>
+            <w:r/>
+            <w:r>
+              <w:rPr>
+                <w:b w:val="0"/>
+                <w:sz w:val="19"/>
+              </w:rPr>
+              <w:t>During test cycle, both apps</w:t>
+            </w:r>
+          </w:p>
+        </w:tc>
+      </w:tr>
+      <w:tr>
+        <w:tc>
+          <w:tcPr>
+            <w:tcW w:type="dxa" w:w="3456"/>
+          </w:tcPr>
+          <w:p>
+            <w:r/>
+            <w:r>
+              <w:rPr>
+                <w:b w:val="0"/>
+                <w:sz w:val="19"/>
+              </w:rPr>
+              <w:t>Build funnel and dashboards</w:t>
+            </w:r>
+          </w:p>
+        </w:tc>
+        <w:tc>
+          <w:tcPr>
+            <w:tcW w:type="dxa" w:w="2016"/>
+          </w:tcPr>
+          <w:p>
+            <w:r/>
+            <w:r>
+              <w:rPr>
+                <w:b w:val="0"/>
+                <w:sz w:val="19"/>
+              </w:rPr>
+              <w:t>Analytics</w:t>
+            </w:r>
+          </w:p>
+        </w:tc>
+        <w:tc>
+          <w:tcPr>
+            <w:tcW w:type="dxa" w:w="4032"/>
+          </w:tcPr>
+          <w:p>
+            <w:r/>
+            <w:r>
+              <w:rPr>
+                <w:b w:val="0"/>
+                <w:sz w:val="19"/>
+              </w:rPr>
+              <w:t>After 24–48h of production data</w:t>
+            </w:r>
+          </w:p>
+        </w:tc>
+      </w:tr>
+    </w:tbl>
+    <w:p/>
+    <w:p>
+      <w:r>
+        <w:rPr>
+          <w:b/>
+          <w:color w:val="632965"/>
+          <w:sz w:val="27"/>
+        </w:rPr>
+        <w:t>8. Dashboard views enabled</w:t>
       </w:r>
     </w:p>
     <w:p>
@@ -2280,7 +2822,7 @@
         <w:t>Journey replay —</w:t>
       </w:r>
       <w:r>
-        <w:t xml:space="preserve"> all events for one payment_attempt_id in timestamp order.</w:t>
+        <w:t xml:space="preserve"> all events for one payment_attempt_id in timestamp order (BigQuery).</w:t>
       </w:r>
     </w:p>
     <w:p>
@@ -2290,7 +2832,7 @@
           <w:color w:val="632965"/>
           <w:sz w:val="27"/>
         </w:rPr>
-        <w:t>8. Implementation notes</w:t>
+        <w:t>9. Implementation notes</w:t>
       </w:r>
     </w:p>
     <w:p>
@@ -2340,7 +2882,7 @@
           <w:color w:val="632965"/>
           <w:sz w:val="27"/>
         </w:rPr>
-        <w:t>9. Decisions required</w:t>
+        <w:t>10. Decisions required</w:t>
       </w:r>
     </w:p>
     <w:tbl>
@@ -2428,7 +2970,7 @@
                 <w:b w:val="0"/>
                 <w:sz w:val="19"/>
               </w:rPr>
-              <w:t>Approve Approach B (14 events, funnel from screen_view)</w:t>
+              <w:t>Confirm payment_flow_abandoned is derived, not fired</w:t>
             </w:r>
           </w:p>
         </w:tc>
@@ -2475,53 +3017,6 @@
                 <w:b w:val="0"/>
                 <w:sz w:val="19"/>
               </w:rPr>
-              <w:t>Confirm payment_flow_abandoned is derived, not fired</w:t>
-            </w:r>
-          </w:p>
-        </w:tc>
-        <w:tc>
-          <w:tcPr>
-            <w:tcW w:type="dxa" w:w="2304"/>
-          </w:tcPr>
-          <w:p>
-            <w:r/>
-            <w:r>
-              <w:rPr>
-                <w:b w:val="0"/>
-                <w:sz w:val="19"/>
-              </w:rPr>
-              <w:t>Analytics</w:t>
-            </w:r>
-          </w:p>
-        </w:tc>
-      </w:tr>
-      <w:tr>
-        <w:tc>
-          <w:tcPr>
-            <w:tcW w:type="dxa" w:w="576"/>
-          </w:tcPr>
-          <w:p>
-            <w:r/>
-            <w:r>
-              <w:rPr>
-                <w:b w:val="0"/>
-                <w:sz w:val="19"/>
-              </w:rPr>
-              <w:t>3</w:t>
-            </w:r>
-          </w:p>
-        </w:tc>
-        <w:tc>
-          <w:tcPr>
-            <w:tcW w:type="dxa" w:w="6624"/>
-          </w:tcPr>
-          <w:p>
-            <w:r/>
-            <w:r>
-              <w:rPr>
-                <w:b w:val="0"/>
-                <w:sz w:val="19"/>
-              </w:rPr>
               <w:t>Approve amount_bucket instead of exact amounts</w:t>
             </w:r>
           </w:p>
@@ -2554,6 +3049,53 @@
                 <w:b w:val="0"/>
                 <w:sz w:val="19"/>
               </w:rPr>
+              <w:t>3</w:t>
+            </w:r>
+          </w:p>
+        </w:tc>
+        <w:tc>
+          <w:tcPr>
+            <w:tcW w:type="dxa" w:w="6624"/>
+          </w:tcPr>
+          <w:p>
+            <w:r/>
+            <w:r>
+              <w:rPr>
+                <w:b w:val="0"/>
+                <w:sz w:val="19"/>
+              </w:rPr>
+              <w:t>Register the 13 custom dimensions before release (§7)</w:t>
+            </w:r>
+          </w:p>
+        </w:tc>
+        <w:tc>
+          <w:tcPr>
+            <w:tcW w:type="dxa" w:w="2304"/>
+          </w:tcPr>
+          <w:p>
+            <w:r/>
+            <w:r>
+              <w:rPr>
+                <w:b w:val="0"/>
+                <w:sz w:val="19"/>
+              </w:rPr>
+              <w:t>Analytics</w:t>
+            </w:r>
+          </w:p>
+        </w:tc>
+      </w:tr>
+      <w:tr>
+        <w:tc>
+          <w:tcPr>
+            <w:tcW w:type="dxa" w:w="576"/>
+          </w:tcPr>
+          <w:p>
+            <w:r/>
+            <w:r>
+              <w:rPr>
+                <w:b w:val="0"/>
+                <w:sz w:val="19"/>
+              </w:rPr>
               <w:t>4</w:t>
             </w:r>
           </w:p>
@@ -2569,7 +3111,7 @@
                 <w:b w:val="0"/>
                 <w:sz w:val="19"/>
               </w:rPr>
-              <w:t>DECIDED — retain the account-number identifier. Follow-up: close the three reset gaps in §6 so it is reliably cleared when a session ends.</w:t>
+              <w:t>Confirm whether BigQuery export is required for journey replay</w:t>
             </w:r>
           </w:p>
         </w:tc>
@@ -2584,7 +3126,7 @@
                 <w:b w:val="0"/>
                 <w:sz w:val="19"/>
               </w:rPr>
-              <w:t>Engineering</w:t>
+              <w:t>Analytics</w:t>
             </w:r>
           </w:p>
         </w:tc>
@@ -2638,6 +3180,20 @@
       </w:tr>
     </w:tbl>
     <w:p/>
+    <w:p>
+      <w:r>
+        <w:rPr>
+          <w:b/>
+        </w:rPr>
+        <w:t>Decided:</w:t>
+      </w:r>
+      <w:r>
+        <w:t xml:space="preserve"> </w:t>
+      </w:r>
+      <w:r>
+        <w:t>Approach — funnel from screen_view, 14 custom events (§3). Customer identifier retained, with the reset gaps in §6 to be closed by Engineering.</w:t>
+      </w:r>
+    </w:p>
     <w:sectPr>
       <w:pgSz w:w="12240" w:h="15840"/>
       <w:pgMar w:top="1152" w:right="1296" w:bottom="1152" w:left="1296" w:header="720" w:footer="720" w:gutter="0"/>

</xml_diff>